<commit_message>
Added vid and report work
</commit_message>
<xml_diff>
--- a/Documentation/Weekly Report/week12/CMSC-4920-Week12Report-Group2.docx
+++ b/Documentation/Weekly Report/week12/CMSC-4920-Week12Report-Group2.docx
@@ -1455,25 +1455,7 @@
         <w:rPr>
           <w:rFonts w:ascii="Times New Roman" w:hAnsi="Times New Roman" w:cs="Times New Roman"/>
         </w:rPr>
-        <w:t>which w</w:t>
-      </w:r>
-      <w:r>
-        <w:rPr>
-          <w:rFonts w:ascii="Times New Roman" w:hAnsi="Times New Roman" w:cs="Times New Roman"/>
-        </w:rPr>
-        <w:t>ere</w:t>
-      </w:r>
-      <w:r>
-        <w:rPr>
-          <w:rFonts w:ascii="Times New Roman" w:hAnsi="Times New Roman" w:cs="Times New Roman"/>
-        </w:rPr>
-        <w:t xml:space="preserve"> to </w:t>
-      </w:r>
-      <w:r>
-        <w:rPr>
-          <w:rFonts w:ascii="Times New Roman" w:hAnsi="Times New Roman" w:cs="Times New Roman"/>
-        </w:rPr>
-        <w:t xml:space="preserve">finalize some of the </w:t>
+        <w:t xml:space="preserve">which were to finalize some of the </w:t>
       </w:r>
       <w:r>
         <w:rPr>
@@ -1485,7 +1467,21 @@
         <w:rPr>
           <w:rFonts w:ascii="Times New Roman" w:hAnsi="Times New Roman" w:cs="Times New Roman"/>
         </w:rPr>
-        <w:t xml:space="preserve"> of the tracker, debug previously added features, work on getting the tracker ready for web deployment, and to work on the teams page</w:t>
+        <w:t xml:space="preserve"> of the tracker, debug previously added features, work on getting the tracker ready for web deployment, and to work on the </w:t>
+      </w:r>
+      <w:proofErr w:type="gramStart"/>
+      <w:r>
+        <w:rPr>
+          <w:rFonts w:ascii="Times New Roman" w:hAnsi="Times New Roman" w:cs="Times New Roman"/>
+        </w:rPr>
+        <w:t>teams</w:t>
+      </w:r>
+      <w:proofErr w:type="gramEnd"/>
+      <w:r>
+        <w:rPr>
+          <w:rFonts w:ascii="Times New Roman" w:hAnsi="Times New Roman" w:cs="Times New Roman"/>
+        </w:rPr>
+        <w:t xml:space="preserve"> page</w:t>
       </w:r>
       <w:r>
         <w:rPr>
@@ -1509,19 +1505,7 @@
         <w:rPr>
           <w:rFonts w:ascii="Times New Roman" w:hAnsi="Times New Roman" w:cs="Times New Roman"/>
         </w:rPr>
-        <w:t>Throughout the discussion, we decided that</w:t>
-      </w:r>
-      <w:r>
-        <w:rPr>
-          <w:rFonts w:ascii="Times New Roman" w:hAnsi="Times New Roman" w:cs="Times New Roman"/>
-        </w:rPr>
-        <w:t xml:space="preserve"> getting the tracker ready for deployment was the most important task</w:t>
-      </w:r>
-      <w:r>
-        <w:rPr>
-          <w:rFonts w:ascii="Times New Roman" w:hAnsi="Times New Roman" w:cs="Times New Roman"/>
-        </w:rPr>
-        <w:t>. Achieving this goal will help us progress into having a finished product.</w:t>
+        <w:t>Throughout the discussion, we decided that getting the tracker ready for deployment was the most important task. Achieving this goal will help us progress into having a finished product.</w:t>
       </w:r>
     </w:p>
     <w:p>
@@ -1561,7 +1545,21 @@
           <w:rFonts w:ascii="Times New Roman" w:hAnsi="Times New Roman" w:cs="Times New Roman"/>
         </w:rPr>
         <w:tab/>
-        <w:t xml:space="preserve">One of the goals accomplished this week was further development of the clubs page. </w:t>
+        <w:t xml:space="preserve">One of the goals accomplished this week was further development of the </w:t>
+      </w:r>
+      <w:proofErr w:type="gramStart"/>
+      <w:r>
+        <w:rPr>
+          <w:rFonts w:ascii="Times New Roman" w:hAnsi="Times New Roman" w:cs="Times New Roman"/>
+        </w:rPr>
+        <w:t>clubs</w:t>
+      </w:r>
+      <w:proofErr w:type="gramEnd"/>
+      <w:r>
+        <w:rPr>
+          <w:rFonts w:ascii="Times New Roman" w:hAnsi="Times New Roman" w:cs="Times New Roman"/>
+        </w:rPr>
+        <w:t xml:space="preserve"> page. </w:t>
       </w:r>
       <w:r>
         <w:rPr>
@@ -1573,13 +1571,193 @@
         <w:rPr>
           <w:rFonts w:ascii="Times New Roman" w:hAnsi="Times New Roman" w:cs="Times New Roman"/>
         </w:rPr>
-        <w:t xml:space="preserve"> the clubs page </w:t>
-      </w:r>
-      <w:r>
-        <w:rPr>
-          <w:rFonts w:ascii="Times New Roman" w:hAnsi="Times New Roman" w:cs="Times New Roman"/>
-        </w:rPr>
-        <w:t>has had some basic features working for some time now, with the deadline of deployment coming up it definitely needed some work. The first change was some very needed UI changes, we made the page much more pleasing to the eyes and added a button in the top right corner that will navigate the user to a create a club page. The second feature we added to was the club details page. When you click the “view” button on a club you will be navigated to its details page, where you will now find the addition of a club leaderboard, member list, and a recent activity list.</w:t>
+        <w:t xml:space="preserve"> the </w:t>
+      </w:r>
+      <w:proofErr w:type="gramStart"/>
+      <w:r>
+        <w:rPr>
+          <w:rFonts w:ascii="Times New Roman" w:hAnsi="Times New Roman" w:cs="Times New Roman"/>
+        </w:rPr>
+        <w:t>clubs</w:t>
+      </w:r>
+      <w:proofErr w:type="gramEnd"/>
+      <w:r>
+        <w:rPr>
+          <w:rFonts w:ascii="Times New Roman" w:hAnsi="Times New Roman" w:cs="Times New Roman"/>
+        </w:rPr>
+        <w:t xml:space="preserve"> page </w:t>
+      </w:r>
+      <w:r>
+        <w:rPr>
+          <w:rFonts w:ascii="Times New Roman" w:hAnsi="Times New Roman" w:cs="Times New Roman"/>
+        </w:rPr>
+        <w:t xml:space="preserve">has had some basic features working for some time now, with the deadline of deployment coming up it </w:t>
+      </w:r>
+      <w:proofErr w:type="gramStart"/>
+      <w:r>
+        <w:rPr>
+          <w:rFonts w:ascii="Times New Roman" w:hAnsi="Times New Roman" w:cs="Times New Roman"/>
+        </w:rPr>
+        <w:t>definitely needed</w:t>
+      </w:r>
+      <w:proofErr w:type="gramEnd"/>
+      <w:r>
+        <w:rPr>
+          <w:rFonts w:ascii="Times New Roman" w:hAnsi="Times New Roman" w:cs="Times New Roman"/>
+        </w:rPr>
+        <w:t xml:space="preserve"> some work. The first change was some very needed UI </w:t>
+      </w:r>
+      <w:proofErr w:type="gramStart"/>
+      <w:r>
+        <w:rPr>
+          <w:rFonts w:ascii="Times New Roman" w:hAnsi="Times New Roman" w:cs="Times New Roman"/>
+        </w:rPr>
+        <w:t>changes,</w:t>
+      </w:r>
+      <w:proofErr w:type="gramEnd"/>
+      <w:r>
+        <w:rPr>
+          <w:rFonts w:ascii="Times New Roman" w:hAnsi="Times New Roman" w:cs="Times New Roman"/>
+        </w:rPr>
+        <w:t xml:space="preserve"> we made the page much more pleasing to the eyes and added a button in the top right corner that will navigate the user to </w:t>
+      </w:r>
+      <w:proofErr w:type="gramStart"/>
+      <w:r>
+        <w:rPr>
+          <w:rFonts w:ascii="Times New Roman" w:hAnsi="Times New Roman" w:cs="Times New Roman"/>
+        </w:rPr>
+        <w:t>a create</w:t>
+      </w:r>
+      <w:proofErr w:type="gramEnd"/>
+      <w:r>
+        <w:rPr>
+          <w:rFonts w:ascii="Times New Roman" w:hAnsi="Times New Roman" w:cs="Times New Roman"/>
+        </w:rPr>
+        <w:t xml:space="preserve"> a club page. The second feature we added to </w:t>
+      </w:r>
+      <w:proofErr w:type="gramStart"/>
+      <w:r>
+        <w:rPr>
+          <w:rFonts w:ascii="Times New Roman" w:hAnsi="Times New Roman" w:cs="Times New Roman"/>
+        </w:rPr>
+        <w:t>was</w:t>
+      </w:r>
+      <w:proofErr w:type="gramEnd"/>
+      <w:r>
+        <w:rPr>
+          <w:rFonts w:ascii="Times New Roman" w:hAnsi="Times New Roman" w:cs="Times New Roman"/>
+        </w:rPr>
+        <w:t xml:space="preserve"> the club details page. When you click the “view” button on a club you will be navigated to its details page, where you will now find the addition of a club leaderboard, member list, and a recent activity list.</w:t>
+      </w:r>
+    </w:p>
+    <w:p>
+      <w:pPr>
+        <w:spacing w:line="480" w:lineRule="auto"/>
+        <w:rPr>
+          <w:rFonts w:ascii="Times New Roman" w:hAnsi="Times New Roman" w:cs="Times New Roman"/>
+        </w:rPr>
+      </w:pPr>
+      <w:r>
+        <w:rPr>
+          <w:rFonts w:ascii="Times New Roman" w:hAnsi="Times New Roman" w:cs="Times New Roman"/>
+        </w:rPr>
+        <w:tab/>
+        <w:t xml:space="preserve">A big goal accomplished this week was </w:t>
+      </w:r>
+      <w:r>
+        <w:rPr>
+          <w:rFonts w:ascii="Times New Roman" w:hAnsi="Times New Roman" w:cs="Times New Roman"/>
+        </w:rPr>
+        <w:t xml:space="preserve">progress on the </w:t>
+      </w:r>
+      <w:proofErr w:type="gramStart"/>
+      <w:r>
+        <w:rPr>
+          <w:rFonts w:ascii="Times New Roman" w:hAnsi="Times New Roman" w:cs="Times New Roman"/>
+        </w:rPr>
+        <w:t>teams</w:t>
+      </w:r>
+      <w:proofErr w:type="gramEnd"/>
+      <w:r>
+        <w:rPr>
+          <w:rFonts w:ascii="Times New Roman" w:hAnsi="Times New Roman" w:cs="Times New Roman"/>
+        </w:rPr>
+        <w:t xml:space="preserve"> page. We</w:t>
+      </w:r>
+      <w:r>
+        <w:rPr>
+          <w:rFonts w:ascii="Times New Roman" w:hAnsi="Times New Roman" w:cs="Times New Roman"/>
+        </w:rPr>
+        <w:t xml:space="preserve"> </w:t>
+      </w:r>
+      <w:proofErr w:type="gramStart"/>
+      <w:r>
+        <w:rPr>
+          <w:rFonts w:ascii="Times New Roman" w:hAnsi="Times New Roman" w:cs="Times New Roman"/>
+        </w:rPr>
+        <w:t xml:space="preserve">added </w:t>
+      </w:r>
+      <w:r>
+        <w:rPr>
+          <w:rFonts w:ascii="Times New Roman" w:hAnsi="Times New Roman" w:cs="Times New Roman"/>
+        </w:rPr>
+        <w:t xml:space="preserve"> the</w:t>
+      </w:r>
+      <w:proofErr w:type="gramEnd"/>
+      <w:r>
+        <w:rPr>
+          <w:rFonts w:ascii="Times New Roman" w:hAnsi="Times New Roman" w:cs="Times New Roman"/>
+        </w:rPr>
+        <w:t xml:space="preserve"> </w:t>
+      </w:r>
+      <w:r>
+        <w:rPr>
+          <w:rFonts w:ascii="Times New Roman" w:hAnsi="Times New Roman" w:cs="Times New Roman"/>
+        </w:rPr>
+        <w:t>feature of coaches being able to invite users into the teams. Coaches can send invites via usernames</w:t>
+      </w:r>
+      <w:r>
+        <w:rPr>
+          <w:rFonts w:ascii="Times New Roman" w:hAnsi="Times New Roman" w:cs="Times New Roman"/>
+        </w:rPr>
+        <w:t>, and that user will receive an invite in their inbox (also a new addition!)</w:t>
+      </w:r>
+      <w:r>
+        <w:rPr>
+          <w:rFonts w:ascii="Times New Roman" w:hAnsi="Times New Roman" w:cs="Times New Roman"/>
+        </w:rPr>
+        <w:t xml:space="preserve">, where they can then accept or reject the invite. If the user accepts, </w:t>
+      </w:r>
+      <w:r>
+        <w:rPr>
+          <w:rFonts w:ascii="Times New Roman" w:hAnsi="Times New Roman" w:cs="Times New Roman"/>
+        </w:rPr>
+        <w:t xml:space="preserve">they can access the team page and see the roster, announcements, schedule, and leaderboard. All of these are new features, as coaches can </w:t>
+      </w:r>
+      <w:r>
+        <w:rPr>
+          <w:rFonts w:ascii="Times New Roman" w:hAnsi="Times New Roman" w:cs="Times New Roman"/>
+        </w:rPr>
+        <w:lastRenderedPageBreak/>
+        <w:t xml:space="preserve">make announcements and create </w:t>
+      </w:r>
+      <w:r>
+        <w:rPr>
+          <w:rFonts w:ascii="Times New Roman" w:hAnsi="Times New Roman" w:cs="Times New Roman"/>
+        </w:rPr>
+        <w:t>scheduled</w:t>
+      </w:r>
+      <w:r>
+        <w:rPr>
+          <w:rFonts w:ascii="Times New Roman" w:hAnsi="Times New Roman" w:cs="Times New Roman"/>
+        </w:rPr>
+        <w:t xml:space="preserve"> events. </w:t>
+      </w:r>
+      <w:r>
+        <w:rPr>
+          <w:rFonts w:ascii="Times New Roman" w:hAnsi="Times New Roman" w:cs="Times New Roman"/>
+        </w:rPr>
+        <w:t>The teams page also has a specific leaderboard for their team.</w:t>
       </w:r>
     </w:p>
     <w:p>
@@ -1632,13 +1810,41 @@
         <w:rPr>
           <w:rFonts w:ascii="Times New Roman" w:hAnsi="Times New Roman" w:cs="Times New Roman"/>
         </w:rPr>
-        <w:t>While working on the clubs page we encountered a problem when we displayed the</w:t>
-      </w:r>
-      <w:r>
-        <w:rPr>
-          <w:rFonts w:ascii="Times New Roman" w:hAnsi="Times New Roman" w:cs="Times New Roman"/>
-        </w:rPr>
-        <w:t xml:space="preserve"> club members recent </w:t>
+        <w:t xml:space="preserve">While working on the </w:t>
+      </w:r>
+      <w:proofErr w:type="gramStart"/>
+      <w:r>
+        <w:rPr>
+          <w:rFonts w:ascii="Times New Roman" w:hAnsi="Times New Roman" w:cs="Times New Roman"/>
+        </w:rPr>
+        <w:t>clubs</w:t>
+      </w:r>
+      <w:proofErr w:type="gramEnd"/>
+      <w:r>
+        <w:rPr>
+          <w:rFonts w:ascii="Times New Roman" w:hAnsi="Times New Roman" w:cs="Times New Roman"/>
+        </w:rPr>
+        <w:t xml:space="preserve"> page we encountered a problem when we displayed the</w:t>
+      </w:r>
+      <w:r>
+        <w:rPr>
+          <w:rFonts w:ascii="Times New Roman" w:hAnsi="Times New Roman" w:cs="Times New Roman"/>
+        </w:rPr>
+        <w:t xml:space="preserve"> club </w:t>
+      </w:r>
+      <w:proofErr w:type="gramStart"/>
+      <w:r>
+        <w:rPr>
+          <w:rFonts w:ascii="Times New Roman" w:hAnsi="Times New Roman" w:cs="Times New Roman"/>
+        </w:rPr>
+        <w:t>members</w:t>
+      </w:r>
+      <w:proofErr w:type="gramEnd"/>
+      <w:r>
+        <w:rPr>
+          <w:rFonts w:ascii="Times New Roman" w:hAnsi="Times New Roman" w:cs="Times New Roman"/>
+        </w:rPr>
+        <w:t xml:space="preserve"> recent </w:t>
       </w:r>
       <w:r>
         <w:rPr>
@@ -1650,7 +1856,21 @@
         <w:rPr>
           <w:rFonts w:ascii="Times New Roman" w:hAnsi="Times New Roman" w:cs="Times New Roman"/>
         </w:rPr>
-        <w:t xml:space="preserve">. The problem was that displaying the activities and adding the like feature to said </w:t>
+        <w:t xml:space="preserve">. The problem was </w:t>
+      </w:r>
+      <w:proofErr w:type="gramStart"/>
+      <w:r>
+        <w:rPr>
+          <w:rFonts w:ascii="Times New Roman" w:hAnsi="Times New Roman" w:cs="Times New Roman"/>
+        </w:rPr>
+        <w:t>that</w:t>
+      </w:r>
+      <w:proofErr w:type="gramEnd"/>
+      <w:r>
+        <w:rPr>
+          <w:rFonts w:ascii="Times New Roman" w:hAnsi="Times New Roman" w:cs="Times New Roman"/>
+        </w:rPr>
+        <w:t xml:space="preserve"> displaying the activities and adding the like feature to said </w:t>
       </w:r>
       <w:r>
         <w:rPr>
@@ -1662,11 +1882,72 @@
         <w:rPr>
           <w:rFonts w:ascii="Times New Roman" w:hAnsi="Times New Roman" w:cs="Times New Roman"/>
         </w:rPr>
-        <w:t>, a member could like their own activity. This is not something we intended users to be able to do.</w:t>
+        <w:t xml:space="preserve">, a member could like their own activity. This is not something we </w:t>
+      </w:r>
+      <w:proofErr w:type="gramStart"/>
+      <w:r>
+        <w:rPr>
+          <w:rFonts w:ascii="Times New Roman" w:hAnsi="Times New Roman" w:cs="Times New Roman"/>
+        </w:rPr>
+        <w:t>intended</w:t>
+      </w:r>
+      <w:proofErr w:type="gramEnd"/>
+      <w:r>
+        <w:rPr>
+          <w:rFonts w:ascii="Times New Roman" w:hAnsi="Times New Roman" w:cs="Times New Roman"/>
+        </w:rPr>
+        <w:t xml:space="preserve"> users to be able to do.</w:t>
       </w:r>
     </w:p>
     <w:p>
       <w:pPr>
+        <w:pStyle w:val="ListParagraph"/>
+        <w:numPr>
+          <w:ilvl w:val="0"/>
+          <w:numId w:val="14"/>
+        </w:numPr>
+        <w:spacing w:line="480" w:lineRule="auto"/>
+        <w:rPr>
+          <w:rFonts w:ascii="Times New Roman" w:hAnsi="Times New Roman" w:cs="Times New Roman"/>
+        </w:rPr>
+      </w:pPr>
+      <w:r>
+        <w:rPr>
+          <w:rFonts w:ascii="Times New Roman" w:hAnsi="Times New Roman" w:cs="Times New Roman"/>
+        </w:rPr>
+        <w:t xml:space="preserve">Not technically a challenge faced, but we would like to have users be invited to their respective teams via email rather than usernames, as coaches </w:t>
+      </w:r>
+      <w:proofErr w:type="gramStart"/>
+      <w:r>
+        <w:rPr>
+          <w:rFonts w:ascii="Times New Roman" w:hAnsi="Times New Roman" w:cs="Times New Roman"/>
+        </w:rPr>
+        <w:t>inviting</w:t>
+      </w:r>
+      <w:proofErr w:type="gramEnd"/>
+      <w:r>
+        <w:rPr>
+          <w:rFonts w:ascii="Times New Roman" w:hAnsi="Times New Roman" w:cs="Times New Roman"/>
+        </w:rPr>
+        <w:t xml:space="preserve"> by their athletes’ emails makes more sense, as that is </w:t>
+      </w:r>
+      <w:proofErr w:type="gramStart"/>
+      <w:r>
+        <w:rPr>
+          <w:rFonts w:ascii="Times New Roman" w:hAnsi="Times New Roman" w:cs="Times New Roman"/>
+        </w:rPr>
+        <w:t>information</w:t>
+      </w:r>
+      <w:proofErr w:type="gramEnd"/>
+      <w:r>
+        <w:rPr>
+          <w:rFonts w:ascii="Times New Roman" w:hAnsi="Times New Roman" w:cs="Times New Roman"/>
+        </w:rPr>
+        <w:t xml:space="preserve"> they have available to them when they join.</w:t>
+      </w:r>
+    </w:p>
+    <w:p>
+      <w:pPr>
         <w:spacing w:line="480" w:lineRule="auto"/>
         <w:rPr>
           <w:rFonts w:ascii="Times New Roman" w:hAnsi="Times New Roman" w:cs="Times New Roman"/>
@@ -1680,7 +1961,6 @@
           <w:b/>
           <w:bCs/>
         </w:rPr>
-        <w:lastRenderedPageBreak/>
         <w:t>Solutions:</w:t>
       </w:r>
     </w:p>
@@ -1701,7 +1981,21 @@
         <w:rPr>
           <w:rFonts w:ascii="Times New Roman" w:hAnsi="Times New Roman" w:cs="Times New Roman"/>
         </w:rPr>
-        <w:t xml:space="preserve">To solve this problem we first added a backend check to not allow users to like their own </w:t>
+        <w:t xml:space="preserve">To solve this </w:t>
+      </w:r>
+      <w:proofErr w:type="gramStart"/>
+      <w:r>
+        <w:rPr>
+          <w:rFonts w:ascii="Times New Roman" w:hAnsi="Times New Roman" w:cs="Times New Roman"/>
+        </w:rPr>
+        <w:t>problem</w:t>
+      </w:r>
+      <w:proofErr w:type="gramEnd"/>
+      <w:r>
+        <w:rPr>
+          <w:rFonts w:ascii="Times New Roman" w:hAnsi="Times New Roman" w:cs="Times New Roman"/>
+        </w:rPr>
+        <w:t xml:space="preserve"> we first added a backend check to not allow users to like their own </w:t>
       </w:r>
       <w:r>
         <w:rPr>
@@ -1713,7 +2007,49 @@
         <w:rPr>
           <w:rFonts w:ascii="Times New Roman" w:hAnsi="Times New Roman" w:cs="Times New Roman"/>
         </w:rPr>
-        <w:t xml:space="preserve">, and if they tried they would receive an error message. After fixing the backend check we add a front end fix by disabling the like button on the users own </w:t>
+        <w:t xml:space="preserve">, and if they </w:t>
+      </w:r>
+      <w:proofErr w:type="gramStart"/>
+      <w:r>
+        <w:rPr>
+          <w:rFonts w:ascii="Times New Roman" w:hAnsi="Times New Roman" w:cs="Times New Roman"/>
+        </w:rPr>
+        <w:t>tried</w:t>
+      </w:r>
+      <w:proofErr w:type="gramEnd"/>
+      <w:r>
+        <w:rPr>
+          <w:rFonts w:ascii="Times New Roman" w:hAnsi="Times New Roman" w:cs="Times New Roman"/>
+        </w:rPr>
+        <w:t xml:space="preserve"> they would receive an error message. After fixing the backend check we add a </w:t>
+      </w:r>
+      <w:proofErr w:type="gramStart"/>
+      <w:r>
+        <w:rPr>
+          <w:rFonts w:ascii="Times New Roman" w:hAnsi="Times New Roman" w:cs="Times New Roman"/>
+        </w:rPr>
+        <w:t>front end</w:t>
+      </w:r>
+      <w:proofErr w:type="gramEnd"/>
+      <w:r>
+        <w:rPr>
+          <w:rFonts w:ascii="Times New Roman" w:hAnsi="Times New Roman" w:cs="Times New Roman"/>
+        </w:rPr>
+        <w:t xml:space="preserve"> fix by disabling the like button on the </w:t>
+      </w:r>
+      <w:proofErr w:type="gramStart"/>
+      <w:r>
+        <w:rPr>
+          <w:rFonts w:ascii="Times New Roman" w:hAnsi="Times New Roman" w:cs="Times New Roman"/>
+        </w:rPr>
+        <w:t>users</w:t>
+      </w:r>
+      <w:proofErr w:type="gramEnd"/>
+      <w:r>
+        <w:rPr>
+          <w:rFonts w:ascii="Times New Roman" w:hAnsi="Times New Roman" w:cs="Times New Roman"/>
+        </w:rPr>
+        <w:t xml:space="preserve"> own </w:t>
       </w:r>
       <w:r>
         <w:rPr>
@@ -1725,7 +2061,21 @@
         <w:rPr>
           <w:rFonts w:ascii="Times New Roman" w:hAnsi="Times New Roman" w:cs="Times New Roman"/>
         </w:rPr>
-        <w:t xml:space="preserve">. The “Thumbs Up” like button and like count is still on a users own </w:t>
+        <w:t xml:space="preserve">. The “Thumbs Up” like button and like count is still on </w:t>
+      </w:r>
+      <w:proofErr w:type="spellStart"/>
+      <w:r>
+        <w:rPr>
+          <w:rFonts w:ascii="Times New Roman" w:hAnsi="Times New Roman" w:cs="Times New Roman"/>
+        </w:rPr>
+        <w:t>a users</w:t>
+      </w:r>
+      <w:proofErr w:type="spellEnd"/>
+      <w:r>
+        <w:rPr>
+          <w:rFonts w:ascii="Times New Roman" w:hAnsi="Times New Roman" w:cs="Times New Roman"/>
+        </w:rPr>
+        <w:t xml:space="preserve"> own </w:t>
       </w:r>
       <w:r>
         <w:rPr>
@@ -1738,6 +2088,25 @@
           <w:rFonts w:ascii="Times New Roman" w:hAnsi="Times New Roman" w:cs="Times New Roman"/>
         </w:rPr>
         <w:t xml:space="preserve"> to display their like count, but the button is not clickable for the user.</w:t>
+      </w:r>
+    </w:p>
+    <w:p>
+      <w:pPr>
+        <w:pStyle w:val="ListParagraph"/>
+        <w:numPr>
+          <w:ilvl w:val="0"/>
+          <w:numId w:val="15"/>
+        </w:numPr>
+        <w:spacing w:line="480" w:lineRule="auto"/>
+        <w:rPr>
+          <w:rFonts w:ascii="Times New Roman" w:hAnsi="Times New Roman" w:cs="Times New Roman"/>
+        </w:rPr>
+      </w:pPr>
+      <w:r>
+        <w:rPr>
+          <w:rFonts w:ascii="Times New Roman" w:hAnsi="Times New Roman" w:cs="Times New Roman"/>
+        </w:rPr>
+        <w:t>This will be a quick fix as we will simply query the database for the entered email instead of the username.</w:t>
       </w:r>
     </w:p>
     <w:p>
@@ -1780,6 +2149,7 @@
         <w:rPr>
           <w:rFonts w:ascii="Times New Roman" w:hAnsi="Times New Roman" w:cs="Times New Roman"/>
         </w:rPr>
+        <w:lastRenderedPageBreak/>
         <w:t xml:space="preserve">Our team made substantial progress over the past week. </w:t>
       </w:r>
       <w:r>
@@ -1804,19 +2174,148 @@
         <w:rPr>
           <w:rFonts w:ascii="Times New Roman" w:hAnsi="Times New Roman" w:cs="Times New Roman"/>
         </w:rPr>
-        <w:t>Many features have been tweaked in our tracker this week, to start off we added many needed components to the clubs and teams pages. We also added an inbox feature that as of right now is only used for invites to a team or a club, but in the future could be used for much more. While much had been added to the tracker t</w:t>
-      </w:r>
-      <w:r>
-        <w:rPr>
-          <w:rFonts w:ascii="Times New Roman" w:hAnsi="Times New Roman" w:cs="Times New Roman"/>
-        </w:rPr>
-        <w:t>he most substantial progress to our tracker this week has definitely been the research and work that is being done to</w:t>
+        <w:t xml:space="preserve">Many features have been tweaked in our tracker </w:t>
+      </w:r>
+      <w:proofErr w:type="gramStart"/>
+      <w:r>
+        <w:rPr>
+          <w:rFonts w:ascii="Times New Roman" w:hAnsi="Times New Roman" w:cs="Times New Roman"/>
+        </w:rPr>
+        <w:t>this week,</w:t>
+      </w:r>
+      <w:proofErr w:type="gramEnd"/>
+      <w:r>
+        <w:rPr>
+          <w:rFonts w:ascii="Times New Roman" w:hAnsi="Times New Roman" w:cs="Times New Roman"/>
+        </w:rPr>
+        <w:t xml:space="preserve"> to start off we added many needed components to the clubs and </w:t>
+      </w:r>
+      <w:proofErr w:type="gramStart"/>
+      <w:r>
+        <w:rPr>
+          <w:rFonts w:ascii="Times New Roman" w:hAnsi="Times New Roman" w:cs="Times New Roman"/>
+        </w:rPr>
+        <w:t>teams</w:t>
+      </w:r>
+      <w:proofErr w:type="gramEnd"/>
+      <w:r>
+        <w:rPr>
+          <w:rFonts w:ascii="Times New Roman" w:hAnsi="Times New Roman" w:cs="Times New Roman"/>
+        </w:rPr>
+        <w:t xml:space="preserve"> pages. We also added an inbox feature that as of right now is only used for invites to a team or a club, but in the future could be used for much more. While much </w:t>
+      </w:r>
+      <w:proofErr w:type="gramStart"/>
+      <w:r>
+        <w:rPr>
+          <w:rFonts w:ascii="Times New Roman" w:hAnsi="Times New Roman" w:cs="Times New Roman"/>
+        </w:rPr>
+        <w:t>had</w:t>
+      </w:r>
+      <w:proofErr w:type="gramEnd"/>
+      <w:r>
+        <w:rPr>
+          <w:rFonts w:ascii="Times New Roman" w:hAnsi="Times New Roman" w:cs="Times New Roman"/>
+        </w:rPr>
+        <w:t xml:space="preserve"> been added to the tracker t</w:t>
+      </w:r>
+      <w:r>
+        <w:rPr>
+          <w:rFonts w:ascii="Times New Roman" w:hAnsi="Times New Roman" w:cs="Times New Roman"/>
+        </w:rPr>
+        <w:t xml:space="preserve">he most substantial progress to our tracker this week has </w:t>
+      </w:r>
+      <w:proofErr w:type="gramStart"/>
+      <w:r>
+        <w:rPr>
+          <w:rFonts w:ascii="Times New Roman" w:hAnsi="Times New Roman" w:cs="Times New Roman"/>
+        </w:rPr>
+        <w:t>definitely been</w:t>
+      </w:r>
+      <w:proofErr w:type="gramEnd"/>
+      <w:r>
+        <w:rPr>
+          <w:rFonts w:ascii="Times New Roman" w:hAnsi="Times New Roman" w:cs="Times New Roman"/>
+        </w:rPr>
+        <w:t xml:space="preserve"> the research and work that is being done to</w:t>
       </w:r>
       <w:r>
         <w:rPr>
           <w:rFonts w:ascii="Times New Roman" w:hAnsi="Times New Roman" w:cs="Times New Roman"/>
         </w:rPr>
         <w:t xml:space="preserve"> get our tracker launched.</w:t>
+      </w:r>
+      <w:r>
+        <w:rPr>
+          <w:rFonts w:ascii="Times New Roman" w:hAnsi="Times New Roman" w:cs="Times New Roman"/>
+        </w:rPr>
+        <w:t xml:space="preserve"> As we move forward</w:t>
+      </w:r>
+      <w:r>
+        <w:rPr>
+          <w:rFonts w:ascii="Times New Roman" w:hAnsi="Times New Roman" w:cs="Times New Roman"/>
+        </w:rPr>
+        <w:t>,</w:t>
+      </w:r>
+      <w:r>
+        <w:rPr>
+          <w:rFonts w:ascii="Times New Roman" w:hAnsi="Times New Roman" w:cs="Times New Roman"/>
+        </w:rPr>
+        <w:t xml:space="preserve"> we will be doing a </w:t>
+      </w:r>
+      <w:proofErr w:type="gramStart"/>
+      <w:r>
+        <w:rPr>
+          <w:rFonts w:ascii="Times New Roman" w:hAnsi="Times New Roman" w:cs="Times New Roman"/>
+        </w:rPr>
+        <w:t>lot</w:t>
+      </w:r>
+      <w:proofErr w:type="gramEnd"/>
+      <w:r>
+        <w:rPr>
+          <w:rFonts w:ascii="Times New Roman" w:hAnsi="Times New Roman" w:cs="Times New Roman"/>
+        </w:rPr>
+        <w:t xml:space="preserve"> stress testing </w:t>
+      </w:r>
+      <w:proofErr w:type="gramStart"/>
+      <w:r>
+        <w:rPr>
+          <w:rFonts w:ascii="Times New Roman" w:hAnsi="Times New Roman" w:cs="Times New Roman"/>
+        </w:rPr>
+        <w:t>in order to</w:t>
+      </w:r>
+      <w:proofErr w:type="gramEnd"/>
+      <w:r>
+        <w:rPr>
+          <w:rFonts w:ascii="Times New Roman" w:hAnsi="Times New Roman" w:cs="Times New Roman"/>
+        </w:rPr>
+        <w:t xml:space="preserve"> make sure our tracker </w:t>
+      </w:r>
+      <w:proofErr w:type="gramStart"/>
+      <w:r>
+        <w:rPr>
+          <w:rFonts w:ascii="Times New Roman" w:hAnsi="Times New Roman" w:cs="Times New Roman"/>
+        </w:rPr>
+        <w:t>is working</w:t>
+      </w:r>
+      <w:proofErr w:type="gramEnd"/>
+      <w:r>
+        <w:rPr>
+          <w:rFonts w:ascii="Times New Roman" w:hAnsi="Times New Roman" w:cs="Times New Roman"/>
+        </w:rPr>
+        <w:t xml:space="preserve"> the way we want it to and that we can properly debug before the final presentation on May 1</w:t>
+      </w:r>
+      <w:r>
+        <w:rPr>
+          <w:rFonts w:ascii="Times New Roman" w:hAnsi="Times New Roman" w:cs="Times New Roman"/>
+          <w:vertAlign w:val="superscript"/>
+        </w:rPr>
+        <w:t>st</w:t>
+      </w:r>
+      <w:r>
+        <w:rPr>
+          <w:rFonts w:ascii="Times New Roman" w:hAnsi="Times New Roman" w:cs="Times New Roman"/>
+        </w:rPr>
+        <w:t>.</w:t>
       </w:r>
     </w:p>
     <w:p>
@@ -1842,7 +2341,6 @@
           <w:sz w:val="24"/>
           <w:szCs w:val="24"/>
         </w:rPr>
-        <w:lastRenderedPageBreak/>
         <w:t>Gantt Chart:</w:t>
       </w:r>
       <w:bookmarkEnd w:id="3"/>
@@ -1997,7 +2495,28 @@
         <w:rPr>
           <w:rFonts w:ascii="Times New Roman" w:hAnsi="Times New Roman" w:cs="Times New Roman"/>
         </w:rPr>
-        <w:t>is going to focus on wrapping up feature development and work on getting ready for deployment. First off we want to work on finishing up our trackers features by adding any needed components. We also want to continuously test our tracker in search of any bugs or broken features. This upcoming week we really want to focus on starting work on our final presentation slides and documents such as the user manual.</w:t>
+        <w:t xml:space="preserve">is going to focus on wrapping up feature development and work on getting ready for deployment. First </w:t>
+      </w:r>
+      <w:proofErr w:type="gramStart"/>
+      <w:r>
+        <w:rPr>
+          <w:rFonts w:ascii="Times New Roman" w:hAnsi="Times New Roman" w:cs="Times New Roman"/>
+        </w:rPr>
+        <w:t>off</w:t>
+      </w:r>
+      <w:proofErr w:type="gramEnd"/>
+      <w:r>
+        <w:rPr>
+          <w:rFonts w:ascii="Times New Roman" w:hAnsi="Times New Roman" w:cs="Times New Roman"/>
+        </w:rPr>
+        <w:t xml:space="preserve"> we want to work on finishing up our trackers </w:t>
+      </w:r>
+      <w:r>
+        <w:rPr>
+          <w:rFonts w:ascii="Times New Roman" w:hAnsi="Times New Roman" w:cs="Times New Roman"/>
+        </w:rPr>
+        <w:lastRenderedPageBreak/>
+        <w:t>features by adding any needed components. We also want to continuously test our tracker in search of any bugs or broken features. This upcoming week we really want to focus on starting work on our final presentation slides and documents such as the user manual.</w:t>
       </w:r>
     </w:p>
     <w:p>

</xml_diff>

<commit_message>
add to report, slides, user manual
</commit_message>
<xml_diff>
--- a/Documentation/Weekly Report/week12/CMSC-4920-Week12Report-Group2.docx
+++ b/Documentation/Weekly Report/week12/CMSC-4920-Week12Report-Group2.docx
@@ -1467,21 +1467,7 @@
         <w:rPr>
           <w:rFonts w:ascii="Times New Roman" w:hAnsi="Times New Roman" w:cs="Times New Roman"/>
         </w:rPr>
-        <w:t xml:space="preserve"> of the tracker, debug previously added features, work on getting the tracker ready for web deployment, and to work on the </w:t>
-      </w:r>
-      <w:proofErr w:type="gramStart"/>
-      <w:r>
-        <w:rPr>
-          <w:rFonts w:ascii="Times New Roman" w:hAnsi="Times New Roman" w:cs="Times New Roman"/>
-        </w:rPr>
-        <w:t>teams</w:t>
-      </w:r>
-      <w:proofErr w:type="gramEnd"/>
-      <w:r>
-        <w:rPr>
-          <w:rFonts w:ascii="Times New Roman" w:hAnsi="Times New Roman" w:cs="Times New Roman"/>
-        </w:rPr>
-        <w:t xml:space="preserve"> page</w:t>
+        <w:t xml:space="preserve"> of the tracker, debug previously added features, work on getting the tracker ready for web deployment, and to work on the teams page</w:t>
       </w:r>
       <w:r>
         <w:rPr>
@@ -1545,21 +1531,7 @@
           <w:rFonts w:ascii="Times New Roman" w:hAnsi="Times New Roman" w:cs="Times New Roman"/>
         </w:rPr>
         <w:tab/>
-        <w:t xml:space="preserve">One of the goals accomplished this week was further development of the </w:t>
-      </w:r>
-      <w:proofErr w:type="gramStart"/>
-      <w:r>
-        <w:rPr>
-          <w:rFonts w:ascii="Times New Roman" w:hAnsi="Times New Roman" w:cs="Times New Roman"/>
-        </w:rPr>
-        <w:t>clubs</w:t>
-      </w:r>
-      <w:proofErr w:type="gramEnd"/>
-      <w:r>
-        <w:rPr>
-          <w:rFonts w:ascii="Times New Roman" w:hAnsi="Times New Roman" w:cs="Times New Roman"/>
-        </w:rPr>
-        <w:t xml:space="preserve"> page. </w:t>
+        <w:t xml:space="preserve">One of the goals accomplished this week was further development of the clubs page. </w:t>
       </w:r>
       <w:r>
         <w:rPr>
@@ -1571,83 +1543,13 @@
         <w:rPr>
           <w:rFonts w:ascii="Times New Roman" w:hAnsi="Times New Roman" w:cs="Times New Roman"/>
         </w:rPr>
-        <w:t xml:space="preserve"> the </w:t>
-      </w:r>
-      <w:proofErr w:type="gramStart"/>
-      <w:r>
-        <w:rPr>
-          <w:rFonts w:ascii="Times New Roman" w:hAnsi="Times New Roman" w:cs="Times New Roman"/>
-        </w:rPr>
-        <w:t>clubs</w:t>
-      </w:r>
-      <w:proofErr w:type="gramEnd"/>
-      <w:r>
-        <w:rPr>
-          <w:rFonts w:ascii="Times New Roman" w:hAnsi="Times New Roman" w:cs="Times New Roman"/>
-        </w:rPr>
-        <w:t xml:space="preserve"> page </w:t>
-      </w:r>
-      <w:r>
-        <w:rPr>
-          <w:rFonts w:ascii="Times New Roman" w:hAnsi="Times New Roman" w:cs="Times New Roman"/>
-        </w:rPr>
-        <w:t xml:space="preserve">has had some basic features working for some time now, with the deadline of deployment coming up it </w:t>
-      </w:r>
-      <w:proofErr w:type="gramStart"/>
-      <w:r>
-        <w:rPr>
-          <w:rFonts w:ascii="Times New Roman" w:hAnsi="Times New Roman" w:cs="Times New Roman"/>
-        </w:rPr>
-        <w:t>definitely needed</w:t>
-      </w:r>
-      <w:proofErr w:type="gramEnd"/>
-      <w:r>
-        <w:rPr>
-          <w:rFonts w:ascii="Times New Roman" w:hAnsi="Times New Roman" w:cs="Times New Roman"/>
-        </w:rPr>
-        <w:t xml:space="preserve"> some work. The first change was some very needed UI </w:t>
-      </w:r>
-      <w:proofErr w:type="gramStart"/>
-      <w:r>
-        <w:rPr>
-          <w:rFonts w:ascii="Times New Roman" w:hAnsi="Times New Roman" w:cs="Times New Roman"/>
-        </w:rPr>
-        <w:t>changes,</w:t>
-      </w:r>
-      <w:proofErr w:type="gramEnd"/>
-      <w:r>
-        <w:rPr>
-          <w:rFonts w:ascii="Times New Roman" w:hAnsi="Times New Roman" w:cs="Times New Roman"/>
-        </w:rPr>
-        <w:t xml:space="preserve"> we made the page much more pleasing to the eyes and added a button in the top right corner that will navigate the user to </w:t>
-      </w:r>
-      <w:proofErr w:type="gramStart"/>
-      <w:r>
-        <w:rPr>
-          <w:rFonts w:ascii="Times New Roman" w:hAnsi="Times New Roman" w:cs="Times New Roman"/>
-        </w:rPr>
-        <w:t>a create</w:t>
-      </w:r>
-      <w:proofErr w:type="gramEnd"/>
-      <w:r>
-        <w:rPr>
-          <w:rFonts w:ascii="Times New Roman" w:hAnsi="Times New Roman" w:cs="Times New Roman"/>
-        </w:rPr>
-        <w:t xml:space="preserve"> a club page. The second feature we added to </w:t>
-      </w:r>
-      <w:proofErr w:type="gramStart"/>
-      <w:r>
-        <w:rPr>
-          <w:rFonts w:ascii="Times New Roman" w:hAnsi="Times New Roman" w:cs="Times New Roman"/>
-        </w:rPr>
-        <w:t>was</w:t>
-      </w:r>
-      <w:proofErr w:type="gramEnd"/>
-      <w:r>
-        <w:rPr>
-          <w:rFonts w:ascii="Times New Roman" w:hAnsi="Times New Roman" w:cs="Times New Roman"/>
-        </w:rPr>
-        <w:t xml:space="preserve"> the club details page. When you click the “view” button on a club you will be navigated to its details page, where you will now find the addition of a club leaderboard, member list, and a recent activity list.</w:t>
+        <w:t xml:space="preserve"> the clubs page </w:t>
+      </w:r>
+      <w:r>
+        <w:rPr>
+          <w:rFonts w:ascii="Times New Roman" w:hAnsi="Times New Roman" w:cs="Times New Roman"/>
+        </w:rPr>
+        <w:t>has had some basic features working for some time now, with the deadline of deployment coming up it definitely needed some work. The first change was some very needed UI changes, we made the page much more pleasing to the eyes and added a button in the top right corner that will navigate the user to a create a club page. The second feature we added to was the club details page. When you click the “view” button on a club you will be navigated to its details page, where you will now find the addition of a club leaderboard, member list, and a recent activity list.</w:t>
       </w:r>
     </w:p>
     <w:p>
@@ -1668,47 +1570,19 @@
         <w:rPr>
           <w:rFonts w:ascii="Times New Roman" w:hAnsi="Times New Roman" w:cs="Times New Roman"/>
         </w:rPr>
-        <w:t xml:space="preserve">progress on the </w:t>
-      </w:r>
-      <w:proofErr w:type="gramStart"/>
-      <w:r>
-        <w:rPr>
-          <w:rFonts w:ascii="Times New Roman" w:hAnsi="Times New Roman" w:cs="Times New Roman"/>
-        </w:rPr>
-        <w:t>teams</w:t>
-      </w:r>
-      <w:proofErr w:type="gramEnd"/>
-      <w:r>
-        <w:rPr>
-          <w:rFonts w:ascii="Times New Roman" w:hAnsi="Times New Roman" w:cs="Times New Roman"/>
-        </w:rPr>
-        <w:t xml:space="preserve"> page. We</w:t>
-      </w:r>
-      <w:r>
-        <w:rPr>
-          <w:rFonts w:ascii="Times New Roman" w:hAnsi="Times New Roman" w:cs="Times New Roman"/>
-        </w:rPr>
-        <w:t xml:space="preserve"> </w:t>
-      </w:r>
-      <w:proofErr w:type="gramStart"/>
-      <w:r>
-        <w:rPr>
-          <w:rFonts w:ascii="Times New Roman" w:hAnsi="Times New Roman" w:cs="Times New Roman"/>
-        </w:rPr>
-        <w:t xml:space="preserve">added </w:t>
-      </w:r>
-      <w:r>
-        <w:rPr>
-          <w:rFonts w:ascii="Times New Roman" w:hAnsi="Times New Roman" w:cs="Times New Roman"/>
-        </w:rPr>
-        <w:t xml:space="preserve"> the</w:t>
-      </w:r>
-      <w:proofErr w:type="gramEnd"/>
-      <w:r>
-        <w:rPr>
-          <w:rFonts w:ascii="Times New Roman" w:hAnsi="Times New Roman" w:cs="Times New Roman"/>
-        </w:rPr>
-        <w:t xml:space="preserve"> </w:t>
+        <w:t>progress on the teams page. We</w:t>
+      </w:r>
+      <w:r>
+        <w:rPr>
+          <w:rFonts w:ascii="Times New Roman" w:hAnsi="Times New Roman" w:cs="Times New Roman"/>
+        </w:rPr>
+        <w:t xml:space="preserve"> added </w:t>
+      </w:r>
+      <w:r>
+        <w:rPr>
+          <w:rFonts w:ascii="Times New Roman" w:hAnsi="Times New Roman" w:cs="Times New Roman"/>
+        </w:rPr>
+        <w:t xml:space="preserve"> the </w:t>
       </w:r>
       <w:r>
         <w:rPr>
@@ -1810,41 +1684,13 @@
         <w:rPr>
           <w:rFonts w:ascii="Times New Roman" w:hAnsi="Times New Roman" w:cs="Times New Roman"/>
         </w:rPr>
-        <w:t xml:space="preserve">While working on the </w:t>
-      </w:r>
-      <w:proofErr w:type="gramStart"/>
-      <w:r>
-        <w:rPr>
-          <w:rFonts w:ascii="Times New Roman" w:hAnsi="Times New Roman" w:cs="Times New Roman"/>
-        </w:rPr>
-        <w:t>clubs</w:t>
-      </w:r>
-      <w:proofErr w:type="gramEnd"/>
-      <w:r>
-        <w:rPr>
-          <w:rFonts w:ascii="Times New Roman" w:hAnsi="Times New Roman" w:cs="Times New Roman"/>
-        </w:rPr>
-        <w:t xml:space="preserve"> page we encountered a problem when we displayed the</w:t>
-      </w:r>
-      <w:r>
-        <w:rPr>
-          <w:rFonts w:ascii="Times New Roman" w:hAnsi="Times New Roman" w:cs="Times New Roman"/>
-        </w:rPr>
-        <w:t xml:space="preserve"> club </w:t>
-      </w:r>
-      <w:proofErr w:type="gramStart"/>
-      <w:r>
-        <w:rPr>
-          <w:rFonts w:ascii="Times New Roman" w:hAnsi="Times New Roman" w:cs="Times New Roman"/>
-        </w:rPr>
-        <w:t>members</w:t>
-      </w:r>
-      <w:proofErr w:type="gramEnd"/>
-      <w:r>
-        <w:rPr>
-          <w:rFonts w:ascii="Times New Roman" w:hAnsi="Times New Roman" w:cs="Times New Roman"/>
-        </w:rPr>
-        <w:t xml:space="preserve"> recent </w:t>
+        <w:t>While working on the clubs page we encountered a problem when we displayed the</w:t>
+      </w:r>
+      <w:r>
+        <w:rPr>
+          <w:rFonts w:ascii="Times New Roman" w:hAnsi="Times New Roman" w:cs="Times New Roman"/>
+        </w:rPr>
+        <w:t xml:space="preserve"> club members recent </w:t>
       </w:r>
       <w:r>
         <w:rPr>
@@ -1856,21 +1702,7 @@
         <w:rPr>
           <w:rFonts w:ascii="Times New Roman" w:hAnsi="Times New Roman" w:cs="Times New Roman"/>
         </w:rPr>
-        <w:t xml:space="preserve">. The problem was </w:t>
-      </w:r>
-      <w:proofErr w:type="gramStart"/>
-      <w:r>
-        <w:rPr>
-          <w:rFonts w:ascii="Times New Roman" w:hAnsi="Times New Roman" w:cs="Times New Roman"/>
-        </w:rPr>
-        <w:t>that</w:t>
-      </w:r>
-      <w:proofErr w:type="gramEnd"/>
-      <w:r>
-        <w:rPr>
-          <w:rFonts w:ascii="Times New Roman" w:hAnsi="Times New Roman" w:cs="Times New Roman"/>
-        </w:rPr>
-        <w:t xml:space="preserve"> displaying the activities and adding the like feature to said </w:t>
+        <w:t xml:space="preserve">. The problem was that displaying the activities and adding the like feature to said </w:t>
       </w:r>
       <w:r>
         <w:rPr>
@@ -1882,21 +1714,7 @@
         <w:rPr>
           <w:rFonts w:ascii="Times New Roman" w:hAnsi="Times New Roman" w:cs="Times New Roman"/>
         </w:rPr>
-        <w:t xml:space="preserve">, a member could like their own activity. This is not something we </w:t>
-      </w:r>
-      <w:proofErr w:type="gramStart"/>
-      <w:r>
-        <w:rPr>
-          <w:rFonts w:ascii="Times New Roman" w:hAnsi="Times New Roman" w:cs="Times New Roman"/>
-        </w:rPr>
-        <w:t>intended</w:t>
-      </w:r>
-      <w:proofErr w:type="gramEnd"/>
-      <w:r>
-        <w:rPr>
-          <w:rFonts w:ascii="Times New Roman" w:hAnsi="Times New Roman" w:cs="Times New Roman"/>
-        </w:rPr>
-        <w:t xml:space="preserve"> users to be able to do.</w:t>
+        <w:t>, a member could like their own activity. This is not something we intended users to be able to do.</w:t>
       </w:r>
     </w:p>
     <w:p>
@@ -1915,35 +1733,179 @@
         <w:rPr>
           <w:rFonts w:ascii="Times New Roman" w:hAnsi="Times New Roman" w:cs="Times New Roman"/>
         </w:rPr>
-        <w:t xml:space="preserve">Not technically a challenge faced, but we would like to have users be invited to their respective teams via email rather than usernames, as coaches </w:t>
-      </w:r>
-      <w:proofErr w:type="gramStart"/>
-      <w:r>
-        <w:rPr>
-          <w:rFonts w:ascii="Times New Roman" w:hAnsi="Times New Roman" w:cs="Times New Roman"/>
-        </w:rPr>
-        <w:t>inviting</w:t>
-      </w:r>
-      <w:proofErr w:type="gramEnd"/>
-      <w:r>
-        <w:rPr>
-          <w:rFonts w:ascii="Times New Roman" w:hAnsi="Times New Roman" w:cs="Times New Roman"/>
-        </w:rPr>
-        <w:t xml:space="preserve"> by their athletes’ emails makes more sense, as that is </w:t>
-      </w:r>
-      <w:proofErr w:type="gramStart"/>
-      <w:r>
-        <w:rPr>
-          <w:rFonts w:ascii="Times New Roman" w:hAnsi="Times New Roman" w:cs="Times New Roman"/>
-        </w:rPr>
-        <w:t>information</w:t>
-      </w:r>
-      <w:proofErr w:type="gramEnd"/>
-      <w:r>
-        <w:rPr>
-          <w:rFonts w:ascii="Times New Roman" w:hAnsi="Times New Roman" w:cs="Times New Roman"/>
-        </w:rPr>
-        <w:t xml:space="preserve"> they have available to them when they join.</w:t>
+        <w:t>Not technically a challenge faced, but we would like to have users be invited to their respective teams via email rather than usernames, as coaches inviting by their athletes’ emails makes more sense, as that is information they have available to them when they join.</w:t>
+      </w:r>
+    </w:p>
+    <w:p>
+      <w:pPr>
+        <w:pStyle w:val="ListParagraph"/>
+        <w:numPr>
+          <w:ilvl w:val="0"/>
+          <w:numId w:val="14"/>
+        </w:numPr>
+        <w:spacing w:line="480" w:lineRule="auto"/>
+        <w:rPr>
+          <w:rFonts w:ascii="Times New Roman" w:hAnsi="Times New Roman" w:cs="Times New Roman"/>
+        </w:rPr>
+      </w:pPr>
+      <w:r>
+        <w:rPr>
+          <w:rFonts w:ascii="Times New Roman" w:hAnsi="Times New Roman" w:cs="Times New Roman"/>
+        </w:rPr>
+        <w:t xml:space="preserve">The biggest challenge of week 12 was the set up and app hosting process. </w:t>
+      </w:r>
+      <w:r>
+        <w:rPr>
+          <w:rFonts w:ascii="Times New Roman" w:hAnsi="Times New Roman" w:cs="Times New Roman"/>
+        </w:rPr>
+        <w:t xml:space="preserve">Microsoft SQL Server was found to be incompatible with most hosting services since it needs such large storage size. It is directly compatible with Azure hosting; however, it would cost a lot of money to pay for database credits. The student azure subscription did not support Azure SQL in our region east US. </w:t>
+      </w:r>
+      <w:r>
+        <w:rPr>
+          <w:rFonts w:ascii="Times New Roman" w:hAnsi="Times New Roman" w:cs="Times New Roman"/>
+        </w:rPr>
+        <w:t xml:space="preserve">Additionally, docker had to be built locally </w:t>
+      </w:r>
+      <w:r>
+        <w:rPr>
+          <w:rFonts w:ascii="Times New Roman" w:hAnsi="Times New Roman" w:cs="Times New Roman"/>
+        </w:rPr>
+        <w:t xml:space="preserve">then pushed to the hosting service. However, compatibility was again an issue. The hosting service </w:t>
+      </w:r>
+      <w:r>
+        <w:rPr>
+          <w:rFonts w:ascii="Times New Roman" w:hAnsi="Times New Roman" w:cs="Times New Roman"/>
+        </w:rPr>
+        <w:t>needs</w:t>
+      </w:r>
+      <w:r>
+        <w:rPr>
+          <w:rFonts w:ascii="Times New Roman" w:hAnsi="Times New Roman" w:cs="Times New Roman"/>
+        </w:rPr>
+        <w:t xml:space="preserve"> </w:t>
+      </w:r>
+      <w:r>
+        <w:rPr>
+          <w:rFonts w:ascii="Times New Roman" w:hAnsi="Times New Roman" w:cs="Times New Roman"/>
+        </w:rPr>
+        <w:t>Linux</w:t>
+      </w:r>
+      <w:r>
+        <w:rPr>
+          <w:rFonts w:ascii="Times New Roman" w:hAnsi="Times New Roman" w:cs="Times New Roman"/>
+        </w:rPr>
+        <w:t>/amd64 but team laptop could only build ARM</w:t>
+      </w:r>
+      <w:r>
+        <w:rPr>
+          <w:rFonts w:ascii="Times New Roman" w:hAnsi="Times New Roman" w:cs="Times New Roman"/>
+        </w:rPr>
+        <w:t xml:space="preserve">64. Downloading system emulators did not succeed to produce the Linux executable. Environment </w:t>
+      </w:r>
+      <w:r>
+        <w:rPr>
+          <w:rFonts w:ascii="Times New Roman" w:hAnsi="Times New Roman" w:cs="Times New Roman"/>
+        </w:rPr>
+        <w:t>variables</w:t>
+      </w:r>
+      <w:r>
+        <w:rPr>
+          <w:rFonts w:ascii="Times New Roman" w:hAnsi="Times New Roman" w:cs="Times New Roman"/>
+        </w:rPr>
+        <w:t xml:space="preserve"> were also challenging </w:t>
+      </w:r>
+      <w:r>
+        <w:rPr>
+          <w:rFonts w:ascii="Times New Roman" w:hAnsi="Times New Roman" w:cs="Times New Roman"/>
+        </w:rPr>
+        <w:t xml:space="preserve">since local variables differed from </w:t>
+      </w:r>
+      <w:r>
+        <w:rPr>
+          <w:rFonts w:ascii="Times New Roman" w:hAnsi="Times New Roman" w:cs="Times New Roman"/>
+        </w:rPr>
+        <w:t>cloud-based</w:t>
+      </w:r>
+      <w:r>
+        <w:rPr>
+          <w:rFonts w:ascii="Times New Roman" w:hAnsi="Times New Roman" w:cs="Times New Roman"/>
+        </w:rPr>
+        <w:t xml:space="preserve"> requirements. Docker was then attempting to be build as a cloud container with MSSQL built separately online </w:t>
+      </w:r>
+      <w:r>
+        <w:rPr>
+          <w:rFonts w:ascii="Times New Roman" w:hAnsi="Times New Roman" w:cs="Times New Roman"/>
+        </w:rPr>
+        <w:t xml:space="preserve">in Docker Hub. Internal network communication was blocked by a paywall. Team decision was made to pay for the private network subscription. This still resulted in </w:t>
+      </w:r>
+      <w:r>
+        <w:rPr>
+          <w:rFonts w:ascii="Times New Roman" w:hAnsi="Times New Roman" w:cs="Times New Roman"/>
+        </w:rPr>
+        <w:t xml:space="preserve">not </w:t>
+      </w:r>
+      <w:r>
+        <w:rPr>
+          <w:rFonts w:ascii="Times New Roman" w:hAnsi="Times New Roman" w:cs="Times New Roman"/>
+        </w:rPr>
+        <w:t xml:space="preserve">being </w:t>
+      </w:r>
+      <w:r>
+        <w:rPr>
+          <w:rFonts w:ascii="Times New Roman" w:hAnsi="Times New Roman" w:cs="Times New Roman"/>
+        </w:rPr>
+        <w:lastRenderedPageBreak/>
+        <w:t>successful</w:t>
+      </w:r>
+      <w:r>
+        <w:rPr>
+          <w:rFonts w:ascii="Times New Roman" w:hAnsi="Times New Roman" w:cs="Times New Roman"/>
+        </w:rPr>
+        <w:t xml:space="preserve"> and was a great source of frustration. At this point, the team decided</w:t>
+      </w:r>
+      <w:r>
+        <w:rPr>
+          <w:rFonts w:ascii="Times New Roman" w:hAnsi="Times New Roman" w:cs="Times New Roman"/>
+        </w:rPr>
+        <w:t xml:space="preserve"> to host locally, exposing the port for others to view through </w:t>
+      </w:r>
+      <w:proofErr w:type="spellStart"/>
+      <w:r>
+        <w:rPr>
+          <w:rFonts w:ascii="Times New Roman" w:hAnsi="Times New Roman" w:cs="Times New Roman"/>
+        </w:rPr>
+        <w:t>ngrok</w:t>
+      </w:r>
+      <w:proofErr w:type="spellEnd"/>
+      <w:r>
+        <w:rPr>
+          <w:rFonts w:ascii="Times New Roman" w:hAnsi="Times New Roman" w:cs="Times New Roman"/>
+        </w:rPr>
+        <w:t xml:space="preserve"> software service. </w:t>
+      </w:r>
+      <w:r>
+        <w:rPr>
+          <w:rFonts w:ascii="Times New Roman" w:hAnsi="Times New Roman" w:cs="Times New Roman"/>
+        </w:rPr>
+        <w:t>Taking time to re</w:t>
+      </w:r>
+      <w:r>
+        <w:rPr>
+          <w:rFonts w:ascii="Times New Roman" w:hAnsi="Times New Roman" w:cs="Times New Roman"/>
+        </w:rPr>
+        <w:t>evaluate the situation</w:t>
+      </w:r>
+      <w:r>
+        <w:rPr>
+          <w:rFonts w:ascii="Times New Roman" w:hAnsi="Times New Roman" w:cs="Times New Roman"/>
+        </w:rPr>
+        <w:t xml:space="preserve">, allowed </w:t>
+      </w:r>
+      <w:r>
+        <w:rPr>
+          <w:rFonts w:ascii="Times New Roman" w:hAnsi="Times New Roman" w:cs="Times New Roman"/>
+        </w:rPr>
+        <w:t xml:space="preserve">for new ideas to surface. </w:t>
       </w:r>
     </w:p>
     <w:p>
@@ -1983,14 +1945,12 @@
         </w:rPr>
         <w:t xml:space="preserve">To solve this </w:t>
       </w:r>
-      <w:proofErr w:type="gramStart"/>
-      <w:r>
-        <w:rPr>
-          <w:rFonts w:ascii="Times New Roman" w:hAnsi="Times New Roman" w:cs="Times New Roman"/>
-        </w:rPr>
-        <w:t>problem</w:t>
-      </w:r>
-      <w:proofErr w:type="gramEnd"/>
+      <w:r>
+        <w:rPr>
+          <w:rFonts w:ascii="Times New Roman" w:hAnsi="Times New Roman" w:cs="Times New Roman"/>
+        </w:rPr>
+        <w:t>problem,</w:t>
+      </w:r>
       <w:r>
         <w:rPr>
           <w:rFonts w:ascii="Times New Roman" w:hAnsi="Times New Roman" w:cs="Times New Roman"/>
@@ -2007,49 +1967,19 @@
         <w:rPr>
           <w:rFonts w:ascii="Times New Roman" w:hAnsi="Times New Roman" w:cs="Times New Roman"/>
         </w:rPr>
-        <w:t xml:space="preserve">, and if they </w:t>
-      </w:r>
-      <w:proofErr w:type="gramStart"/>
-      <w:r>
-        <w:rPr>
-          <w:rFonts w:ascii="Times New Roman" w:hAnsi="Times New Roman" w:cs="Times New Roman"/>
-        </w:rPr>
-        <w:t>tried</w:t>
-      </w:r>
-      <w:proofErr w:type="gramEnd"/>
-      <w:r>
-        <w:rPr>
-          <w:rFonts w:ascii="Times New Roman" w:hAnsi="Times New Roman" w:cs="Times New Roman"/>
-        </w:rPr>
-        <w:t xml:space="preserve"> they would receive an error message. After fixing the backend check we add a </w:t>
-      </w:r>
-      <w:proofErr w:type="gramStart"/>
-      <w:r>
-        <w:rPr>
-          <w:rFonts w:ascii="Times New Roman" w:hAnsi="Times New Roman" w:cs="Times New Roman"/>
-        </w:rPr>
-        <w:t>front end</w:t>
-      </w:r>
-      <w:proofErr w:type="gramEnd"/>
-      <w:r>
-        <w:rPr>
-          <w:rFonts w:ascii="Times New Roman" w:hAnsi="Times New Roman" w:cs="Times New Roman"/>
-        </w:rPr>
-        <w:t xml:space="preserve"> fix by disabling the like button on the </w:t>
-      </w:r>
-      <w:proofErr w:type="gramStart"/>
-      <w:r>
-        <w:rPr>
-          <w:rFonts w:ascii="Times New Roman" w:hAnsi="Times New Roman" w:cs="Times New Roman"/>
-        </w:rPr>
-        <w:t>users</w:t>
-      </w:r>
-      <w:proofErr w:type="gramEnd"/>
-      <w:r>
-        <w:rPr>
-          <w:rFonts w:ascii="Times New Roman" w:hAnsi="Times New Roman" w:cs="Times New Roman"/>
-        </w:rPr>
-        <w:t xml:space="preserve"> own </w:t>
+        <w:t xml:space="preserve">, and if they tried they would receive an error message. After fixing the backend check we add a </w:t>
+      </w:r>
+      <w:r>
+        <w:rPr>
+          <w:rFonts w:ascii="Times New Roman" w:hAnsi="Times New Roman" w:cs="Times New Roman"/>
+        </w:rPr>
+        <w:t>front-end</w:t>
+      </w:r>
+      <w:r>
+        <w:rPr>
+          <w:rFonts w:ascii="Times New Roman" w:hAnsi="Times New Roman" w:cs="Times New Roman"/>
+        </w:rPr>
+        <w:t xml:space="preserve"> fix by disabling the like button on the users own </w:t>
       </w:r>
       <w:r>
         <w:rPr>
@@ -2112,6 +2042,138 @@
     <w:p>
       <w:pPr>
         <w:pStyle w:val="ListParagraph"/>
+        <w:numPr>
+          <w:ilvl w:val="0"/>
+          <w:numId w:val="15"/>
+        </w:numPr>
+        <w:spacing w:line="480" w:lineRule="auto"/>
+        <w:rPr>
+          <w:rFonts w:ascii="Times New Roman" w:hAnsi="Times New Roman" w:cs="Times New Roman"/>
+        </w:rPr>
+      </w:pPr>
+      <w:r>
+        <w:rPr>
+          <w:rFonts w:ascii="Times New Roman" w:hAnsi="Times New Roman" w:cs="Times New Roman"/>
+        </w:rPr>
+        <w:t>Many solutions were tested for resolving hosting.</w:t>
+      </w:r>
+      <w:r>
+        <w:rPr>
+          <w:rFonts w:ascii="Times New Roman" w:hAnsi="Times New Roman" w:cs="Times New Roman"/>
+        </w:rPr>
+        <w:t xml:space="preserve"> </w:t>
+      </w:r>
+      <w:r>
+        <w:rPr>
+          <w:rFonts w:ascii="Times New Roman" w:hAnsi="Times New Roman" w:cs="Times New Roman"/>
+        </w:rPr>
+        <w:t>Success was found b</w:t>
+      </w:r>
+      <w:r>
+        <w:rPr>
+          <w:rFonts w:ascii="Times New Roman" w:hAnsi="Times New Roman" w:cs="Times New Roman"/>
+        </w:rPr>
+        <w:t xml:space="preserve">y moving our database to Azure online SQL Server, this removed </w:t>
+      </w:r>
+      <w:r>
+        <w:rPr>
+          <w:rFonts w:ascii="Times New Roman" w:hAnsi="Times New Roman" w:cs="Times New Roman"/>
+        </w:rPr>
+        <w:t>compatibility</w:t>
+      </w:r>
+      <w:r>
+        <w:rPr>
+          <w:rFonts w:ascii="Times New Roman" w:hAnsi="Times New Roman" w:cs="Times New Roman"/>
+        </w:rPr>
+        <w:t xml:space="preserve"> issues.</w:t>
+      </w:r>
+      <w:r>
+        <w:rPr>
+          <w:rFonts w:ascii="Times New Roman" w:hAnsi="Times New Roman" w:cs="Times New Roman"/>
+        </w:rPr>
+        <w:t xml:space="preserve"> </w:t>
+      </w:r>
+      <w:r>
+        <w:rPr>
+          <w:rFonts w:ascii="Times New Roman" w:hAnsi="Times New Roman" w:cs="Times New Roman"/>
+        </w:rPr>
+        <w:t>By changing the region on our Azure Subscription</w:t>
+      </w:r>
+      <w:r>
+        <w:rPr>
+          <w:rFonts w:ascii="Times New Roman" w:hAnsi="Times New Roman" w:cs="Times New Roman"/>
+        </w:rPr>
+        <w:t xml:space="preserve"> to west US,</w:t>
+      </w:r>
+      <w:r>
+        <w:rPr>
+          <w:rFonts w:ascii="Times New Roman" w:hAnsi="Times New Roman" w:cs="Times New Roman"/>
+        </w:rPr>
+        <w:t xml:space="preserve"> the server and database feature w</w:t>
+      </w:r>
+      <w:r>
+        <w:rPr>
+          <w:rFonts w:ascii="Times New Roman" w:hAnsi="Times New Roman" w:cs="Times New Roman"/>
+        </w:rPr>
+        <w:t xml:space="preserve">ere accessible. </w:t>
+      </w:r>
+      <w:r>
+        <w:rPr>
+          <w:rFonts w:ascii="Times New Roman" w:hAnsi="Times New Roman" w:cs="Times New Roman"/>
+        </w:rPr>
+        <w:t xml:space="preserve">Then the app itself was moved from the Azure Container App that was not successful, to a paid Render service. Once environment variables were filled in properly, and database start up race condition </w:t>
+      </w:r>
+      <w:r>
+        <w:rPr>
+          <w:rFonts w:ascii="Times New Roman" w:hAnsi="Times New Roman" w:cs="Times New Roman"/>
+        </w:rPr>
+        <w:t xml:space="preserve">was corrected, the app finally went live at </w:t>
+      </w:r>
+      <w:hyperlink r:id="rId11" w:history="1">
+        <w:r>
+          <w:rPr>
+            <w:rStyle w:val="Hyperlink"/>
+            <w:rFonts w:ascii="Times New Roman" w:hAnsi="Times New Roman" w:cs="Times New Roman"/>
+          </w:rPr>
+          <w:t>https://vulcanactivitytracker.onrender.com</w:t>
+        </w:r>
+      </w:hyperlink>
+      <w:r>
+        <w:rPr>
+          <w:rFonts w:ascii="Times New Roman" w:hAnsi="Times New Roman" w:cs="Times New Roman"/>
+        </w:rPr>
+        <w:t xml:space="preserve">. Now our team has to track how much resources </w:t>
+      </w:r>
+      <w:r>
+        <w:rPr>
+          <w:rFonts w:ascii="Times New Roman" w:hAnsi="Times New Roman" w:cs="Times New Roman"/>
+        </w:rPr>
+        <w:t xml:space="preserve">both the Azure SQL server and Render app hosting </w:t>
+      </w:r>
+      <w:r>
+        <w:rPr>
+          <w:rFonts w:ascii="Times New Roman" w:hAnsi="Times New Roman" w:cs="Times New Roman"/>
+        </w:rPr>
+        <w:t xml:space="preserve">takes to stay within a reasonable student budget. The app will be suspended between </w:t>
+      </w:r>
+      <w:r>
+        <w:rPr>
+          <w:rFonts w:ascii="Times New Roman" w:hAnsi="Times New Roman" w:cs="Times New Roman"/>
+        </w:rPr>
+        <w:t>demos to preserver credits on our free subscription.</w:t>
+      </w:r>
+    </w:p>
+    <w:p>
+      <w:pPr>
+        <w:spacing w:line="480" w:lineRule="auto"/>
+        <w:rPr>
+          <w:rFonts w:ascii="Times New Roman" w:hAnsi="Times New Roman" w:cs="Times New Roman"/>
+        </w:rPr>
+      </w:pPr>
+    </w:p>
+    <w:p>
+      <w:pPr>
+        <w:pStyle w:val="ListParagraph"/>
         <w:spacing w:line="480" w:lineRule="auto"/>
         <w:rPr>
           <w:rFonts w:ascii="Times New Roman" w:hAnsi="Times New Roman" w:cs="Times New Roman"/>
@@ -2149,7 +2211,6 @@
         <w:rPr>
           <w:rFonts w:ascii="Times New Roman" w:hAnsi="Times New Roman" w:cs="Times New Roman"/>
         </w:rPr>
-        <w:lastRenderedPageBreak/>
         <w:t xml:space="preserve">Our team made substantial progress over the past week. </w:t>
       </w:r>
       <w:r>
@@ -2174,69 +2235,13 @@
         <w:rPr>
           <w:rFonts w:ascii="Times New Roman" w:hAnsi="Times New Roman" w:cs="Times New Roman"/>
         </w:rPr>
-        <w:t xml:space="preserve">Many features have been tweaked in our tracker </w:t>
-      </w:r>
-      <w:proofErr w:type="gramStart"/>
-      <w:r>
-        <w:rPr>
-          <w:rFonts w:ascii="Times New Roman" w:hAnsi="Times New Roman" w:cs="Times New Roman"/>
-        </w:rPr>
-        <w:t>this week,</w:t>
-      </w:r>
-      <w:proofErr w:type="gramEnd"/>
-      <w:r>
-        <w:rPr>
-          <w:rFonts w:ascii="Times New Roman" w:hAnsi="Times New Roman" w:cs="Times New Roman"/>
-        </w:rPr>
-        <w:t xml:space="preserve"> to start off we added many needed components to the clubs and </w:t>
-      </w:r>
-      <w:proofErr w:type="gramStart"/>
-      <w:r>
-        <w:rPr>
-          <w:rFonts w:ascii="Times New Roman" w:hAnsi="Times New Roman" w:cs="Times New Roman"/>
-        </w:rPr>
-        <w:t>teams</w:t>
-      </w:r>
-      <w:proofErr w:type="gramEnd"/>
-      <w:r>
-        <w:rPr>
-          <w:rFonts w:ascii="Times New Roman" w:hAnsi="Times New Roman" w:cs="Times New Roman"/>
-        </w:rPr>
-        <w:t xml:space="preserve"> pages. We also added an inbox feature that as of right now is only used for invites to a team or a club, but in the future could be used for much more. While much </w:t>
-      </w:r>
-      <w:proofErr w:type="gramStart"/>
-      <w:r>
-        <w:rPr>
-          <w:rFonts w:ascii="Times New Roman" w:hAnsi="Times New Roman" w:cs="Times New Roman"/>
-        </w:rPr>
-        <w:t>had</w:t>
-      </w:r>
-      <w:proofErr w:type="gramEnd"/>
-      <w:r>
-        <w:rPr>
-          <w:rFonts w:ascii="Times New Roman" w:hAnsi="Times New Roman" w:cs="Times New Roman"/>
-        </w:rPr>
-        <w:t xml:space="preserve"> been added to the tracker t</w:t>
-      </w:r>
-      <w:r>
-        <w:rPr>
-          <w:rFonts w:ascii="Times New Roman" w:hAnsi="Times New Roman" w:cs="Times New Roman"/>
-        </w:rPr>
-        <w:t xml:space="preserve">he most substantial progress to our tracker this week has </w:t>
-      </w:r>
-      <w:proofErr w:type="gramStart"/>
-      <w:r>
-        <w:rPr>
-          <w:rFonts w:ascii="Times New Roman" w:hAnsi="Times New Roman" w:cs="Times New Roman"/>
-        </w:rPr>
-        <w:t>definitely been</w:t>
-      </w:r>
-      <w:proofErr w:type="gramEnd"/>
-      <w:r>
-        <w:rPr>
-          <w:rFonts w:ascii="Times New Roman" w:hAnsi="Times New Roman" w:cs="Times New Roman"/>
-        </w:rPr>
-        <w:t xml:space="preserve"> the research and work that is being done to</w:t>
+        <w:t>Many features have been tweaked in our tracker this week, to start off we added many needed components to the clubs and teams pages. We also added an inbox feature that as of right now is only used for invites to a team or a club, but in the future could be used for much more. While much had been added to the tracker t</w:t>
+      </w:r>
+      <w:r>
+        <w:rPr>
+          <w:rFonts w:ascii="Times New Roman" w:hAnsi="Times New Roman" w:cs="Times New Roman"/>
+        </w:rPr>
+        <w:t>he most substantial progress to our tracker this week has definitely been the research and work that is being done to</w:t>
       </w:r>
       <w:r>
         <w:rPr>
@@ -2260,49 +2265,7 @@
         <w:rPr>
           <w:rFonts w:ascii="Times New Roman" w:hAnsi="Times New Roman" w:cs="Times New Roman"/>
         </w:rPr>
-        <w:t xml:space="preserve"> we will be doing a </w:t>
-      </w:r>
-      <w:proofErr w:type="gramStart"/>
-      <w:r>
-        <w:rPr>
-          <w:rFonts w:ascii="Times New Roman" w:hAnsi="Times New Roman" w:cs="Times New Roman"/>
-        </w:rPr>
-        <w:t>lot</w:t>
-      </w:r>
-      <w:proofErr w:type="gramEnd"/>
-      <w:r>
-        <w:rPr>
-          <w:rFonts w:ascii="Times New Roman" w:hAnsi="Times New Roman" w:cs="Times New Roman"/>
-        </w:rPr>
-        <w:t xml:space="preserve"> stress testing </w:t>
-      </w:r>
-      <w:proofErr w:type="gramStart"/>
-      <w:r>
-        <w:rPr>
-          <w:rFonts w:ascii="Times New Roman" w:hAnsi="Times New Roman" w:cs="Times New Roman"/>
-        </w:rPr>
-        <w:t>in order to</w:t>
-      </w:r>
-      <w:proofErr w:type="gramEnd"/>
-      <w:r>
-        <w:rPr>
-          <w:rFonts w:ascii="Times New Roman" w:hAnsi="Times New Roman" w:cs="Times New Roman"/>
-        </w:rPr>
-        <w:t xml:space="preserve"> make sure our tracker </w:t>
-      </w:r>
-      <w:proofErr w:type="gramStart"/>
-      <w:r>
-        <w:rPr>
-          <w:rFonts w:ascii="Times New Roman" w:hAnsi="Times New Roman" w:cs="Times New Roman"/>
-        </w:rPr>
-        <w:t>is working</w:t>
-      </w:r>
-      <w:proofErr w:type="gramEnd"/>
-      <w:r>
-        <w:rPr>
-          <w:rFonts w:ascii="Times New Roman" w:hAnsi="Times New Roman" w:cs="Times New Roman"/>
-        </w:rPr>
-        <w:t xml:space="preserve"> the way we want it to and that we can properly debug before the final presentation on May 1</w:t>
+        <w:t xml:space="preserve"> we will be doing a lot stress testing in order to make sure our tracker is working the way we want it to and that we can properly debug before the final presentation on May 1</w:t>
       </w:r>
       <w:r>
         <w:rPr>
@@ -2366,7 +2329,7 @@
                     <pic:cNvPicPr/>
                   </pic:nvPicPr>
                   <pic:blipFill>
-                    <a:blip r:embed="rId11"/>
+                    <a:blip r:embed="rId12"/>
                     <a:stretch>
                       <a:fillRect/>
                     </a:stretch>
@@ -2415,6 +2378,7 @@
           <w:sz w:val="24"/>
           <w:szCs w:val="24"/>
         </w:rPr>
+        <w:lastRenderedPageBreak/>
         <w:t xml:space="preserve">Week </w:t>
       </w:r>
       <w:r>
@@ -2495,28 +2459,7 @@
         <w:rPr>
           <w:rFonts w:ascii="Times New Roman" w:hAnsi="Times New Roman" w:cs="Times New Roman"/>
         </w:rPr>
-        <w:t xml:space="preserve">is going to focus on wrapping up feature development and work on getting ready for deployment. First </w:t>
-      </w:r>
-      <w:proofErr w:type="gramStart"/>
-      <w:r>
-        <w:rPr>
-          <w:rFonts w:ascii="Times New Roman" w:hAnsi="Times New Roman" w:cs="Times New Roman"/>
-        </w:rPr>
-        <w:t>off</w:t>
-      </w:r>
-      <w:proofErr w:type="gramEnd"/>
-      <w:r>
-        <w:rPr>
-          <w:rFonts w:ascii="Times New Roman" w:hAnsi="Times New Roman" w:cs="Times New Roman"/>
-        </w:rPr>
-        <w:t xml:space="preserve"> we want to work on finishing up our trackers </w:t>
-      </w:r>
-      <w:r>
-        <w:rPr>
-          <w:rFonts w:ascii="Times New Roman" w:hAnsi="Times New Roman" w:cs="Times New Roman"/>
-        </w:rPr>
-        <w:lastRenderedPageBreak/>
-        <w:t>features by adding any needed components. We also want to continuously test our tracker in search of any bugs or broken features. This upcoming week we really want to focus on starting work on our final presentation slides and documents such as the user manual.</w:t>
+        <w:t>is going to focus on wrapping up feature development and work on getting ready for deployment. First off we want to work on finishing up our trackers features by adding any needed components. We also want to continuously test our tracker in search of any bugs or broken features. This upcoming week we really want to focus on starting work on our final presentation slides and documents such as the user manual.</w:t>
       </w:r>
     </w:p>
     <w:p>
@@ -2954,7 +2897,7 @@
       </w:pPr>
     </w:p>
     <w:sectPr>
-      <w:footerReference w:type="default" r:id="rId12"/>
+      <w:footerReference w:type="default" r:id="rId13"/>
       <w:pgSz w:w="12240" w:h="15840"/>
       <w:pgMar w:top="1440" w:right="1440" w:bottom="1440" w:left="1440" w:header="720" w:footer="720" w:gutter="0"/>
       <w:pgBorders w:display="firstPage" w:offsetFrom="page">

</xml_diff>